<commit_message>
Simplify autologon so we dont crash into the safeties
</commit_message>
<xml_diff>
--- a/UFTC Thin Client Troubleshooting.docx
+++ b/UFTC Thin Client Troubleshooting.docx
@@ -1253,44 +1253,8 @@
         </w:rPr>
         <w:t xml:space="preserve"> fidelity with the lowest latency at the expense of bandwidth (2mbit). If you’d like a less bandwith intense mode use just /microphone, however that mode is known for microphone latency.</w:t>
       </w:r>
-    </w:p>
-    <w:p>
-      <w:pPr>
-        <w:rPr>
-          <w:lang w:val="en-US"/>
-        </w:rPr>
-      </w:pPr>
-      <w:r>
-        <w:rPr>
-          <w:b/>
-          <w:bCs/>
-          <w:lang w:val="en-US"/>
-        </w:rPr>
-        <w:t>/autologon</w:t>
-      </w:r>
-      <w:r>
-        <w:rPr>
-          <w:b/>
-          <w:bCs/>
-          <w:lang w:val="en-US"/>
-        </w:rPr>
-        <w:t xml:space="preserve"> </w:t>
-      </w:r>
-      <w:r>
-        <w:rPr>
-          <w:lang w:val="en-US"/>
-        </w:rPr>
-        <w:t>Skips the login screen, can be combined with /u: and /p: (Insecure)</w:t>
-      </w:r>
       <w:bookmarkStart w:id="0" w:name="_GoBack"/>
       <w:bookmarkEnd w:id="0"/>
-    </w:p>
-    <w:p>
-      <w:pPr>
-        <w:rPr>
-          <w:lang w:val="en-US"/>
-        </w:rPr>
-      </w:pPr>
       <w:r>
         <w:rPr>
           <w:lang w:val="en-US"/>

</xml_diff>